<commit_message>
Add formal academic references on Monte Carlo methods in Active Inference to methodology paper
</commit_message>
<xml_diff>
--- a/docs/Monte_Carlo_Methodology_Active_Inference_Thomas_Riebl.docx
+++ b/docs/Monte_Carlo_Methodology_Active_Inference_Thomas_Riebl.docx
@@ -28,7 +28,7 @@
         </w:p>
       </w:sdtContent>
     </w:sdt>
-    <w:bookmarkStart w:id="27" w:name="Xaa73c1f04f53dc831ad97ab313c65f2ffeb8059"/>
+    <w:bookmarkStart w:id="28" w:name="Xaa73c1f04f53dc831ad97ab313c65f2ffeb8059"/>
     <w:p>
       <w:pPr>
         <w:pStyle w:val="Heading1"/>
@@ -5926,8 +5926,366 @@
         <w:t xml:space="preserve">).</w:t>
       </w:r>
     </w:p>
+    <w:p>
+      <w:r>
+        <w:pict>
+          <v:rect style="width:0;height:1.5pt" o:hralign="center" o:hrstd="t" o:hr="t"/>
+        </w:pict>
+      </w:r>
+    </w:p>
     <w:bookmarkEnd w:id="26"/>
+    <w:bookmarkStart w:id="27" w:name="academic-references-relevant-literature"/>
+    <w:p>
+      <w:pPr>
+        <w:pStyle w:val="Heading2"/>
+      </w:pPr>
+      <w:r>
+        <w:t xml:space="preserve">6. Academic References &amp; Relevant Literature</w:t>
+      </w:r>
+    </w:p>
+    <w:p>
+      <w:pPr>
+        <w:pStyle w:val="Compact"/>
+        <w:numPr>
+          <w:ilvl w:val="0"/>
+          <w:numId w:val="1004"/>
+        </w:numPr>
+      </w:pPr>
+      <w:r>
+        <w:rPr>
+          <w:b/>
+          <w:bCs/>
+        </w:rPr>
+        <w:t xml:space="preserve">Fountas, Z., Sajid, N., Mediano, P. A. M., &amp; Friston, K. (2020).</w:t>
+      </w:r>
+      <w:r>
+        <w:br/>
+      </w:r>
+      <w:r>
+        <w:rPr>
+          <w:i/>
+          <w:iCs/>
+        </w:rPr>
+        <w:t xml:space="preserve">Deep active inference agents using Monte-Carlo methods.</w:t>
+      </w:r>
+      <w:r>
+        <w:br/>
+      </w:r>
+      <w:r>
+        <w:rPr>
+          <w:i/>
+          <w:iCs/>
+        </w:rPr>
+        <w:t xml:space="preserve">Advances in Neural Information Processing Systems (NeurIPS 2020)</w:t>
+      </w:r>
+      <w:r>
+        <w:t xml:space="preserve">, 33, 11662–11675.</w:t>
+      </w:r>
+      <w:r>
+        <w:br/>
+      </w:r>
+      <w:r>
+        <w:rPr>
+          <w:i/>
+          <w:iCs/>
+        </w:rPr>
+        <w:t xml:space="preserve">(Foundational paper introducing Monte Carlo sampling and MCTS into Active Inference for deep planning).</w:t>
+      </w:r>
+    </w:p>
+    <w:p>
+      <w:pPr>
+        <w:pStyle w:val="Compact"/>
+        <w:numPr>
+          <w:ilvl w:val="0"/>
+          <w:numId w:val="1004"/>
+        </w:numPr>
+      </w:pPr>
+      <w:r>
+        <w:rPr>
+          <w:b/>
+          <w:bCs/>
+        </w:rPr>
+        <w:t xml:space="preserve">Da Costa, L., Parr, T., Sajid, N., Veselic, S., Neacsu, V., &amp; Friston, K. (2020).</w:t>
+      </w:r>
+      <w:r>
+        <w:br/>
+      </w:r>
+      <w:r>
+        <w:rPr>
+          <w:i/>
+          <w:iCs/>
+        </w:rPr>
+        <w:t xml:space="preserve">Active inference on discrete state-spaces: A synthesis.</w:t>
+      </w:r>
+      <w:r>
+        <w:br/>
+      </w:r>
+      <w:r>
+        <w:rPr>
+          <w:i/>
+          <w:iCs/>
+        </w:rPr>
+        <w:t xml:space="preserve">Journal of Mathematical Psychology</w:t>
+      </w:r>
+      <w:r>
+        <w:t xml:space="preserve">, 99, 102447.</w:t>
+      </w:r>
+      <w:r>
+        <w:br/>
+      </w:r>
+      <w:r>
+        <w:rPr>
+          <w:i/>
+          <w:iCs/>
+        </w:rPr>
+        <w:t xml:space="preserve">(Comprehensive mathematical formalization of discrete POMDP categorical sampling, likelihood matrices, and policy inference).</w:t>
+      </w:r>
+    </w:p>
+    <w:p>
+      <w:pPr>
+        <w:pStyle w:val="Compact"/>
+        <w:numPr>
+          <w:ilvl w:val="0"/>
+          <w:numId w:val="1004"/>
+        </w:numPr>
+      </w:pPr>
+      <w:r>
+        <w:rPr>
+          <w:b/>
+          <w:bCs/>
+        </w:rPr>
+        <w:t xml:space="preserve">Parr, T., &amp; Friston, K. J. (2018).</w:t>
+      </w:r>
+      <w:r>
+        <w:br/>
+      </w:r>
+      <w:r>
+        <w:rPr>
+          <w:i/>
+          <w:iCs/>
+        </w:rPr>
+        <w:t xml:space="preserve">The anatomy of choice: active inference and agency.</w:t>
+      </w:r>
+      <w:r>
+        <w:br/>
+      </w:r>
+      <w:r>
+        <w:rPr>
+          <w:i/>
+          <w:iCs/>
+        </w:rPr>
+        <w:t xml:space="preserve">Cognitive Neuroscience</w:t>
+      </w:r>
+      <w:r>
+        <w:t xml:space="preserve">, 9(1-2), 11–27.</w:t>
+      </w:r>
+      <w:r>
+        <w:br/>
+      </w:r>
+      <w:r>
+        <w:rPr>
+          <w:i/>
+          <w:iCs/>
+        </w:rPr>
+        <w:t xml:space="preserve">(Formalizing intentional agency and counterfactual policy search over extended temporal horizons).</w:t>
+      </w:r>
+    </w:p>
+    <w:p>
+      <w:pPr>
+        <w:pStyle w:val="Compact"/>
+        <w:numPr>
+          <w:ilvl w:val="0"/>
+          <w:numId w:val="1004"/>
+        </w:numPr>
+      </w:pPr>
+      <w:r>
+        <w:rPr>
+          <w:b/>
+          <w:bCs/>
+        </w:rPr>
+        <w:t xml:space="preserve">Tschantz, A., Millidge, B., Seth, A. K., &amp; Buckley, C. L. (2020).</w:t>
+      </w:r>
+      <w:r>
+        <w:br/>
+      </w:r>
+      <w:r>
+        <w:rPr>
+          <w:i/>
+          <w:iCs/>
+        </w:rPr>
+        <w:t xml:space="preserve">Reinforcement learning through active inference.</w:t>
+      </w:r>
+      <w:r>
+        <w:br/>
+      </w:r>
+      <w:r>
+        <w:rPr>
+          <w:i/>
+          <w:iCs/>
+        </w:rPr>
+        <w:t xml:space="preserve">arXiv preprint arXiv:2002.12636.</w:t>
+      </w:r>
+      <w:r>
+        <w:br/>
+      </w:r>
+      <w:r>
+        <w:rPr>
+          <w:i/>
+          <w:iCs/>
+        </w:rPr>
+        <w:t xml:space="preserve">(Benchmarking multi-trial ensemble exploration vs. exploitation in deceptive environments).</w:t>
+      </w:r>
+    </w:p>
+    <w:p>
+      <w:pPr>
+        <w:pStyle w:val="Compact"/>
+        <w:numPr>
+          <w:ilvl w:val="0"/>
+          <w:numId w:val="1004"/>
+        </w:numPr>
+      </w:pPr>
+      <w:r>
+        <w:rPr>
+          <w:b/>
+          <w:bCs/>
+        </w:rPr>
+        <w:t xml:space="preserve">Gershman, S. J. (2019).</w:t>
+      </w:r>
+      <w:r>
+        <w:br/>
+      </w:r>
+      <w:r>
+        <w:rPr>
+          <w:i/>
+          <w:iCs/>
+        </w:rPr>
+        <w:t xml:space="preserve">The generative adversary in brain and machine.</w:t>
+      </w:r>
+      <w:r>
+        <w:br/>
+      </w:r>
+      <w:r>
+        <w:rPr>
+          <w:i/>
+          <w:iCs/>
+        </w:rPr>
+        <w:t xml:space="preserve">Trends in Cognitive Sciences</w:t>
+      </w:r>
+      <w:r>
+        <w:t xml:space="preserve">, 23(1), 8–17.</w:t>
+      </w:r>
+      <w:r>
+        <w:br/>
+      </w:r>
+      <w:r>
+        <w:rPr>
+          <w:i/>
+          <w:iCs/>
+        </w:rPr>
+        <w:t xml:space="preserve">(Neural sampling hypothesis: the brain as a stochastic Monte Carlo sampler of posterior probability distributions).</w:t>
+      </w:r>
+    </w:p>
+    <w:p>
+      <w:pPr>
+        <w:pStyle w:val="Compact"/>
+        <w:numPr>
+          <w:ilvl w:val="0"/>
+          <w:numId w:val="1004"/>
+        </w:numPr>
+      </w:pPr>
+      <w:r>
+        <w:rPr>
+          <w:b/>
+          <w:bCs/>
+        </w:rPr>
+        <w:t xml:space="preserve">Tononi, G., Albantakis, L., Boly, M., Massimini, M., &amp; Koch, C. (2023).</w:t>
+      </w:r>
+      <w:r>
+        <w:br/>
+      </w:r>
+      <w:r>
+        <w:rPr>
+          <w:i/>
+          <w:iCs/>
+        </w:rPr>
+        <w:t xml:space="preserve">Integrated information theory (IIT) 4.0: Formulating the properties of phenomenal existence in physical terms.</w:t>
+      </w:r>
+      <w:r>
+        <w:br/>
+      </w:r>
+      <w:r>
+        <w:rPr>
+          <w:i/>
+          <w:iCs/>
+        </w:rPr>
+        <w:t xml:space="preserve">PLOS Computational Biology</w:t>
+      </w:r>
+      <w:r>
+        <w:t xml:space="preserve">, 19(10), e1011465.</w:t>
+      </w:r>
+    </w:p>
+    <w:p>
+      <w:pPr>
+        <w:pStyle w:val="Compact"/>
+        <w:numPr>
+          <w:ilvl w:val="0"/>
+          <w:numId w:val="1004"/>
+        </w:numPr>
+      </w:pPr>
+      <w:r>
+        <w:rPr>
+          <w:b/>
+          <w:bCs/>
+        </w:rPr>
+        <w:t xml:space="preserve">Riebl, T. (2026).</w:t>
+      </w:r>
+      <w:r>
+        <w:br/>
+      </w:r>
+      <w:r>
+        <w:rPr>
+          <w:i/>
+          <w:iCs/>
+        </w:rPr>
+        <w:t xml:space="preserve">The Conative-Integrative Framework (CIF): The 6th Axiom of Autopoietic Causal Persistence and the Temporal Mechanics of Consciousness.</w:t>
+      </w:r>
+      <w:r>
+        <w:br/>
+      </w:r>
+      <w:r>
+        <w:rPr>
+          <w:i/>
+          <w:iCs/>
+        </w:rPr>
+        <w:t xml:space="preserve">Repository:</w:t>
+      </w:r>
+      <w:r>
+        <w:rPr>
+          <w:i/>
+          <w:iCs/>
+        </w:rPr>
+        <w:t xml:space="preserve"> </w:t>
+      </w:r>
+      <w:hyperlink r:id="rId9">
+        <w:r>
+          <w:rPr>
+            <w:rStyle w:val="Hyperlink"/>
+            <w:i/>
+            <w:iCs/>
+          </w:rPr>
+          <w:t xml:space="preserve">https://github.com/Thriebl/time-and-consciousness</w:t>
+        </w:r>
+      </w:hyperlink>
+      <w:r>
+        <w:rPr>
+          <w:i/>
+          <w:iCs/>
+        </w:rPr>
+        <w:t xml:space="preserve">.</w:t>
+      </w:r>
+    </w:p>
     <w:bookmarkEnd w:id="27"/>
+    <w:bookmarkEnd w:id="28"/>
     <w:sectPr>
       <w:footnotePr>
         <w:numRestart w:val="eachSect"/>
@@ -6264,6 +6622,36 @@
   </w:num>
   <w:num w:numId="1003">
     <w:abstractNumId w:val="991"/>
+  </w:num>
+  <w:num w:numId="1004">
+    <w:abstractNumId w:val="99411"/>
+    <w:lvlOverride w:ilvl="0">
+      <w:startOverride w:val="1"/>
+    </w:lvlOverride>
+    <w:lvlOverride w:ilvl="1">
+      <w:startOverride w:val="1"/>
+    </w:lvlOverride>
+    <w:lvlOverride w:ilvl="2">
+      <w:startOverride w:val="1"/>
+    </w:lvlOverride>
+    <w:lvlOverride w:ilvl="3">
+      <w:startOverride w:val="1"/>
+    </w:lvlOverride>
+    <w:lvlOverride w:ilvl="4">
+      <w:startOverride w:val="1"/>
+    </w:lvlOverride>
+    <w:lvlOverride w:ilvl="5">
+      <w:startOverride w:val="1"/>
+    </w:lvlOverride>
+    <w:lvlOverride w:ilvl="6">
+      <w:startOverride w:val="1"/>
+    </w:lvlOverride>
+    <w:lvlOverride w:ilvl="7">
+      <w:startOverride w:val="1"/>
+    </w:lvlOverride>
+    <w:lvlOverride w:ilvl="8">
+      <w:startOverride w:val="1"/>
+    </w:lvlOverride>
   </w:num>
 </w:numbering>
 </file>

</xml_diff>

<commit_message>
Add standardized Tool Attribution & Colophon to all papers and notebooks
</commit_message>
<xml_diff>
--- a/docs/Monte_Carlo_Methodology_Active_Inference_Thomas_Riebl.docx
+++ b/docs/Monte_Carlo_Methodology_Active_Inference_Thomas_Riebl.docx
@@ -28,7 +28,7 @@
         </w:p>
       </w:sdtContent>
     </w:sdt>
-    <w:bookmarkStart w:id="28" w:name="Xaa73c1f04f53dc831ad97ab313c65f2ffeb8059"/>
+    <w:bookmarkStart w:id="32" w:name="Xaa73c1f04f53dc831ad97ab313c65f2ffeb8059"/>
     <w:p>
       <w:pPr>
         <w:pStyle w:val="Heading1"/>
@@ -6284,8 +6284,210 @@
         <w:t xml:space="preserve">.</w:t>
       </w:r>
     </w:p>
+    <w:p>
+      <w:r>
+        <w:pict>
+          <v:rect style="width:0;height:1.5pt" o:hralign="center" o:hrstd="t" o:hr="t"/>
+        </w:pict>
+      </w:r>
+    </w:p>
     <w:bookmarkEnd w:id="27"/>
-    <w:bookmarkEnd w:id="28"/>
+    <w:bookmarkStart w:id="31" w:name="tool-attribution-colophon"/>
+    <w:p>
+      <w:pPr>
+        <w:pStyle w:val="Heading2"/>
+      </w:pPr>
+      <w:r>
+        <w:t xml:space="preserve">Tool Attribution &amp; Colophon</w:t>
+      </w:r>
+    </w:p>
+    <w:p>
+      <w:pPr>
+        <w:pStyle w:val="BlockText"/>
+      </w:pPr>
+      <w:r>
+        <w:t xml:space="preserve">[!NOTE]</w:t>
+      </w:r>
+      <w:r>
+        <w:t xml:space="preserve"> </w:t>
+      </w:r>
+      <w:r>
+        <w:rPr>
+          <w:b/>
+          <w:bCs/>
+        </w:rPr>
+        <w:t xml:space="preserve">Tooling Colophon:</w:t>
+      </w:r>
+      <w:r>
+        <w:br/>
+      </w:r>
+      <w:r>
+        <w:t xml:space="preserve">This theoretical treatise, simulation methodology, and scientific synthesis were conceptualized and authored by</w:t>
+      </w:r>
+      <w:r>
+        <w:t xml:space="preserve"> </w:t>
+      </w:r>
+      <w:r>
+        <w:rPr>
+          <w:b/>
+          <w:bCs/>
+        </w:rPr>
+        <w:t xml:space="preserve">Thomas Riebl</w:t>
+      </w:r>
+      <w:r>
+        <w:t xml:space="preserve"> </w:t>
+      </w:r>
+      <w:r>
+        <w:t xml:space="preserve">(Luxembourg) as part of</w:t>
+      </w:r>
+      <w:r>
+        <w:t xml:space="preserve"> </w:t>
+      </w:r>
+      <w:r>
+        <w:rPr>
+          <w:b/>
+          <w:bCs/>
+        </w:rPr>
+        <w:t xml:space="preserve">The Conative-Integrative Framework (CIF)</w:t>
+      </w:r>
+      <w:r>
+        <w:t xml:space="preserve">.</w:t>
+      </w:r>
+      <w:r>
+        <w:br/>
+      </w:r>
+      <w:r>
+        <w:t xml:space="preserve">The conceptual formulation, mathematical modeling, simulation scripts, vector diagrams, and multi-format document compilation (Word</w:t>
+      </w:r>
+      <w:r>
+        <w:t xml:space="preserve"> </w:t>
+      </w:r>
+      <w:r>
+        <w:rPr>
+          <w:rStyle w:val="VerbatimChar"/>
+        </w:rPr>
+        <w:t xml:space="preserve">.docx</w:t>
+      </w:r>
+      <w:r>
+        <w:t xml:space="preserve">, Print-Ready A4 Portrait PDF, and Jupyter Notebooks) were developed with the assistance of</w:t>
+      </w:r>
+      <w:r>
+        <w:t xml:space="preserve"> </w:t>
+      </w:r>
+      <w:r>
+        <w:rPr>
+          <w:b/>
+          <w:bCs/>
+        </w:rPr>
+        <w:t xml:space="preserve">Google Gemini (Antigravity Advanced Agentic Coding System)</w:t>
+      </w:r>
+      <w:r>
+        <w:t xml:space="preserve"> </w:t>
+      </w:r>
+      <w:r>
+        <w:t xml:space="preserve">(September 2026).</w:t>
+      </w:r>
+    </w:p>
+    <w:p>
+      <w:r>
+        <w:pict>
+          <v:rect style="width:0;height:1.5pt" o:hralign="center" o:hrstd="t" o:hr="t"/>
+        </w:pict>
+      </w:r>
+    </w:p>
+    <w:bookmarkStart w:id="30" w:name="vault-repository-references"/>
+    <w:p>
+      <w:pPr>
+        <w:pStyle w:val="Heading3"/>
+      </w:pPr>
+      <w:r>
+        <w:t xml:space="preserve">Vault &amp; Repository References</w:t>
+      </w:r>
+    </w:p>
+    <w:p>
+      <w:pPr>
+        <w:pStyle w:val="Compact"/>
+        <w:numPr>
+          <w:ilvl w:val="0"/>
+          <w:numId w:val="1005"/>
+        </w:numPr>
+      </w:pPr>
+      <w:r>
+        <w:rPr>
+          <w:b/>
+          <w:bCs/>
+        </w:rPr>
+        <w:t xml:space="preserve">Repository:</w:t>
+      </w:r>
+      <w:r>
+        <w:t xml:space="preserve"> </w:t>
+      </w:r>
+      <w:hyperlink r:id="rId9">
+        <w:r>
+          <w:rPr>
+            <w:rStyle w:val="VerbatimChar"/>
+          </w:rPr>
+          <w:t xml:space="preserve">https://github.com/Thriebl/time-and-consciousness</w:t>
+        </w:r>
+      </w:hyperlink>
+    </w:p>
+    <w:p>
+      <w:pPr>
+        <w:pStyle w:val="Compact"/>
+        <w:numPr>
+          <w:ilvl w:val="0"/>
+          <w:numId w:val="1005"/>
+        </w:numPr>
+      </w:pPr>
+      <w:r>
+        <w:rPr>
+          <w:b/>
+          <w:bCs/>
+        </w:rPr>
+        <w:t xml:space="preserve">Master Framework Paper (CIF):</w:t>
+      </w:r>
+      <w:r>
+        <w:t xml:space="preserve"> </w:t>
+      </w:r>
+      <w:hyperlink r:id="rId28">
+        <w:r>
+          <w:rPr>
+            <w:rStyle w:val="VerbatimChar"/>
+          </w:rPr>
+          <w:t xml:space="preserve">/home/thr/Documents/The_Conative_Integrative_Framework_Thomas_Riebl.pdf</w:t>
+        </w:r>
+      </w:hyperlink>
+    </w:p>
+    <w:p>
+      <w:pPr>
+        <w:pStyle w:val="Compact"/>
+        <w:numPr>
+          <w:ilvl w:val="0"/>
+          <w:numId w:val="1005"/>
+        </w:numPr>
+      </w:pPr>
+      <w:r>
+        <w:rPr>
+          <w:b/>
+          <w:bCs/>
+        </w:rPr>
+        <w:t xml:space="preserve">Vault Archive:</w:t>
+      </w:r>
+      <w:r>
+        <w:t xml:space="preserve"> </w:t>
+      </w:r>
+      <w:hyperlink r:id="rId29">
+        <w:r>
+          <w:rPr>
+            <w:rStyle w:val="VerbatimChar"/>
+          </w:rPr>
+          <w:t xml:space="preserve">/home/thr/Documents/ThRNotes/03-professional/braindumps/</w:t>
+        </w:r>
+      </w:hyperlink>
+    </w:p>
+    <w:bookmarkEnd w:id="30"/>
+    <w:bookmarkEnd w:id="31"/>
+    <w:bookmarkEnd w:id="32"/>
     <w:sectPr>
       <w:footnotePr>
         <w:numRestart w:val="eachSect"/>
@@ -6652,6 +6854,9 @@
     <w:lvlOverride w:ilvl="8">
       <w:startOverride w:val="1"/>
     </w:lvlOverride>
+  </w:num>
+  <w:num w:numId="1005">
+    <w:abstractNumId w:val="991"/>
   </w:num>
 </w:numbering>
 </file>

</xml_diff>